<commit_message>
feat: hiện % hoàn thành và trạng thái dự án ở danh sách dự án; cập nhật báo cáo tuần 3
- Thẻ dự án: % hoàn thành, thanh tiến độ, số việc Đã làm / Đang làm / Chuẩn bị làm,
  trạng thái Chưa bắt đầu / Đang thực hiện / Đã hoàn thành
- Thêm test tiến độ dự án (26 test)
- Báo cáo tuần 3 bổ sung mục tiến độ dự án

Co-Authored-By: Claude Opus 5.5 <noreply@anthropic.com>
</commit_message>
<xml_diff>
--- a/reports/bao-cao-tuan-03.docx
+++ b/reports/bao-cao-tuan-03.docx
@@ -1001,7 +1001,7 @@
                 <w:sz w:val="26"/>
                 <w:szCs w:val="26"/>
               </w:rPr>
-              <w:t xml:space="preserve">Giao diện và cách chạy</w:t>
+              <w:t xml:space="preserve">Tiến độ dự án</w:t>
             </w:r>
           </w:p>
         </w:tc>
@@ -1031,7 +1031,7 @@
                 <w:sz w:val="26"/>
                 <w:szCs w:val="26"/>
               </w:rPr>
-              <w:t xml:space="preserve">Làm lại giao diện nền (gradient, hiệu ứng kính mờ), ảnh đại diện chữ cái đầu. File chay-du-an.bat mở API, đợi API sẵn sàng rồi tự mở trình duyệt.</w:t>
+              <w:t xml:space="preserve">Trang danh sách dự án hiển thị ngay (chưa cần mở chi tiết): % hoàn thành, thanh tiến độ, số công việc Đã làm (Done) / Đang làm (In progress, Review) / Chuẩn bị làm (To do) và trạng thái chung của dự án: Chưa bắt đầu / Đang thực hiện / Đã hoàn thành.</w:t>
             </w:r>
           </w:p>
         </w:tc>
@@ -1093,6 +1093,98 @@
                 <w:sz w:val="26"/>
                 <w:szCs w:val="26"/>
               </w:rPr>
+              <w:t xml:space="preserve">Giao diện và cách chạy</w:t>
+            </w:r>
+          </w:p>
+        </w:tc>
+        <w:tc>
+          <w:tcPr>
+            <w:tcW w:type="dxa" w:w="5771"/>
+            <w:tcBorders>
+              <w:top w:val="single" w:color="808080" w:sz="4"/>
+              <w:left w:val="single" w:color="808080" w:sz="4"/>
+              <w:bottom w:val="single" w:color="808080" w:sz="4"/>
+              <w:right w:val="single" w:color="808080" w:sz="4"/>
+            </w:tcBorders>
+            <w:tcMar>
+              <w:top w:type="dxa" w:w="60"/>
+              <w:left w:type="dxa" w:w="100"/>
+              <w:bottom w:type="dxa" w:w="60"/>
+              <w:right w:type="dxa" w:w="100"/>
+            </w:tcMar>
+          </w:tcPr>
+          <w:p>
+            <w:pPr>
+              <w:jc w:val="left"/>
+            </w:pPr>
+            <w:r>
+              <w:rPr>
+                <w:rFonts w:ascii="Times New Roman" w:cs="Times New Roman" w:eastAsia="Times New Roman" w:hAnsi="Times New Roman"/>
+                <w:sz w:val="26"/>
+                <w:szCs w:val="26"/>
+              </w:rPr>
+              <w:t xml:space="preserve">Làm lại giao diện nền (gradient, hiệu ứng kính mờ), ảnh đại diện chữ cái đầu. File chay-du-an.bat mở API, đợi API sẵn sàng rồi tự mở trình duyệt.</w:t>
+            </w:r>
+          </w:p>
+        </w:tc>
+      </w:tr>
+      <w:tr>
+        <w:tc>
+          <w:tcPr>
+            <w:tcW w:type="dxa" w:w="700"/>
+            <w:tcBorders>
+              <w:top w:val="single" w:color="808080" w:sz="4"/>
+              <w:left w:val="single" w:color="808080" w:sz="4"/>
+              <w:bottom w:val="single" w:color="808080" w:sz="4"/>
+              <w:right w:val="single" w:color="808080" w:sz="4"/>
+            </w:tcBorders>
+            <w:tcMar>
+              <w:top w:type="dxa" w:w="60"/>
+              <w:left w:type="dxa" w:w="100"/>
+              <w:bottom w:type="dxa" w:w="60"/>
+              <w:right w:type="dxa" w:w="100"/>
+            </w:tcMar>
+          </w:tcPr>
+          <w:p>
+            <w:pPr>
+              <w:jc w:val="left"/>
+            </w:pPr>
+            <w:r>
+              <w:rPr>
+                <w:rFonts w:ascii="Times New Roman" w:cs="Times New Roman" w:eastAsia="Times New Roman" w:hAnsi="Times New Roman"/>
+                <w:sz w:val="26"/>
+                <w:szCs w:val="26"/>
+              </w:rPr>
+              <w:t xml:space="preserve">10</w:t>
+            </w:r>
+          </w:p>
+        </w:tc>
+        <w:tc>
+          <w:tcPr>
+            <w:tcW w:type="dxa" w:w="2600"/>
+            <w:tcBorders>
+              <w:top w:val="single" w:color="808080" w:sz="4"/>
+              <w:left w:val="single" w:color="808080" w:sz="4"/>
+              <w:bottom w:val="single" w:color="808080" w:sz="4"/>
+              <w:right w:val="single" w:color="808080" w:sz="4"/>
+            </w:tcBorders>
+            <w:tcMar>
+              <w:top w:type="dxa" w:w="60"/>
+              <w:left w:type="dxa" w:w="100"/>
+              <w:bottom w:type="dxa" w:w="60"/>
+              <w:right w:type="dxa" w:w="100"/>
+            </w:tcMar>
+          </w:tcPr>
+          <w:p>
+            <w:pPr>
+              <w:jc w:val="left"/>
+            </w:pPr>
+            <w:r>
+              <w:rPr>
+                <w:rFonts w:ascii="Times New Roman" w:cs="Times New Roman" w:eastAsia="Times New Roman" w:hAnsi="Times New Roman"/>
+                <w:sz w:val="26"/>
+                <w:szCs w:val="26"/>
+              </w:rPr>
               <w:t xml:space="preserve">Kiểm thử</w:t>
             </w:r>
           </w:p>
@@ -1123,7 +1215,7 @@
                 <w:sz w:val="26"/>
                 <w:szCs w:val="26"/>
               </w:rPr>
-              <w:t xml:space="preserve">Bộ test tự động tăng lên 25 test (quy trình duyệt bài, phân quyền, nộp file, nhắc hạn, giao nhiều người, đăng nhập Google). Bắt đầu chạy thử thực tế cùng các thành viên trong nhóm.</w:t>
+              <w:t xml:space="preserve">Bộ test tự động tăng lên 26 test (quy trình duyệt bài, phân quyền, nộp file, nhắc hạn, giao nhiều người, đăng nhập Google, tiến độ dự án). Bắt đầu chạy thử thực tế cùng các thành viên trong nhóm.</w:t>
             </w:r>
           </w:p>
         </w:tc>
@@ -1269,7 +1361,7 @@
           <w:sz w:val="26"/>
           <w:szCs w:val="26"/>
         </w:rPr>
-        <w:t xml:space="preserve">Hệ thống đã có đầy đủ luồng chính: giao việc → làm → gửi báo cáo → nhận xét → duyệt.</w:t>
+        <w:t xml:space="preserve">Hệ thống đã có đầy đủ luồng chính: giao việc → làm → gửi báo cáo → nhận xét → duyệt; theo dõi được % hoàn thành của từng dự án.</w:t>
       </w:r>
     </w:p>
     <w:p>
@@ -1287,7 +1379,7 @@
           <w:sz w:val="26"/>
           <w:szCs w:val="26"/>
         </w:rPr>
-        <w:t xml:space="preserve">25/25 test tự động đạt.</w:t>
+        <w:t xml:space="preserve">26/26 test tự động đạt.</w:t>
       </w:r>
     </w:p>
     <w:p>

</xml_diff>